<commit_message>
added notes about spark and kubernetes
</commit_message>
<xml_diff>
--- a/docker/docker notes.docx
+++ b/docker/docker notes.docx
@@ -254,10 +254,42 @@
     </w:p>
     <w:p>
       <w:pPr>
+        <w:pStyle w:val="Heading2"/>
+      </w:pPr>
+      <w:r>
+        <w:t>Debugging on Linux</w:t>
+      </w:r>
+    </w:p>
+    <w:p>
+      <w:pPr>
         <w:pStyle w:val="ListParagraph"/>
         <w:numPr>
           <w:ilvl w:val="0"/>
-          <w:numId w:val="3"/>
+          <w:numId w:val="4"/>
+        </w:numPr>
+      </w:pPr>
+      <w:r>
+        <w:t>journalctl -xe --unit=docker.service</w:t>
+      </w:r>
+    </w:p>
+    <w:p>
+      <w:pPr>
+        <w:pStyle w:val="ListParagraph"/>
+        <w:numPr>
+          <w:ilvl w:val="0"/>
+          <w:numId w:val="4"/>
+        </w:numPr>
+      </w:pPr>
+      <w:r>
+        <w:t>systemctl status docker.socket</w:t>
+      </w:r>
+    </w:p>
+    <w:p>
+      <w:pPr>
+        <w:pStyle w:val="ListParagraph"/>
+        <w:numPr>
+          <w:ilvl w:val="0"/>
+          <w:numId w:val="4"/>
         </w:numPr>
       </w:pPr>
     </w:p>
@@ -638,6 +670,119 @@
       </w:rPr>
     </w:lvl>
   </w:abstractNum>
+  <w:abstractNum w:abstractNumId="3" w15:restartNumberingAfterBreak="0">
+    <w:nsid w:val="796C0646"/>
+    <w:multiLevelType w:val="hybridMultilevel"/>
+    <w:tmpl w:val="AA1EAC44"/>
+    <w:lvl w:ilvl="0" w:tplc="04090001">
+      <w:start w:val="1"/>
+      <w:numFmt w:val="bullet"/>
+      <w:lvlText w:val=""/>
+      <w:lvlJc w:val="left"/>
+      <w:pPr>
+        <w:ind w:left="720" w:hanging="360"/>
+      </w:pPr>
+      <w:rPr>
+        <w:rFonts w:ascii="Symbol" w:hAnsi="Symbol" w:hint="default"/>
+      </w:rPr>
+    </w:lvl>
+    <w:lvl w:ilvl="1" w:tplc="04090003" w:tentative="1">
+      <w:start w:val="1"/>
+      <w:numFmt w:val="bullet"/>
+      <w:lvlText w:val="o"/>
+      <w:lvlJc w:val="left"/>
+      <w:pPr>
+        <w:ind w:left="1440" w:hanging="360"/>
+      </w:pPr>
+      <w:rPr>
+        <w:rFonts w:ascii="Courier New" w:hAnsi="Courier New" w:cs="Courier New" w:hint="default"/>
+      </w:rPr>
+    </w:lvl>
+    <w:lvl w:ilvl="2" w:tplc="04090005" w:tentative="1">
+      <w:start w:val="1"/>
+      <w:numFmt w:val="bullet"/>
+      <w:lvlText w:val=""/>
+      <w:lvlJc w:val="left"/>
+      <w:pPr>
+        <w:ind w:left="2160" w:hanging="360"/>
+      </w:pPr>
+      <w:rPr>
+        <w:rFonts w:ascii="Wingdings" w:hAnsi="Wingdings" w:hint="default"/>
+      </w:rPr>
+    </w:lvl>
+    <w:lvl w:ilvl="3" w:tplc="04090001" w:tentative="1">
+      <w:start w:val="1"/>
+      <w:numFmt w:val="bullet"/>
+      <w:lvlText w:val=""/>
+      <w:lvlJc w:val="left"/>
+      <w:pPr>
+        <w:ind w:left="2880" w:hanging="360"/>
+      </w:pPr>
+      <w:rPr>
+        <w:rFonts w:ascii="Symbol" w:hAnsi="Symbol" w:hint="default"/>
+      </w:rPr>
+    </w:lvl>
+    <w:lvl w:ilvl="4" w:tplc="04090003" w:tentative="1">
+      <w:start w:val="1"/>
+      <w:numFmt w:val="bullet"/>
+      <w:lvlText w:val="o"/>
+      <w:lvlJc w:val="left"/>
+      <w:pPr>
+        <w:ind w:left="3600" w:hanging="360"/>
+      </w:pPr>
+      <w:rPr>
+        <w:rFonts w:ascii="Courier New" w:hAnsi="Courier New" w:cs="Courier New" w:hint="default"/>
+      </w:rPr>
+    </w:lvl>
+    <w:lvl w:ilvl="5" w:tplc="04090005" w:tentative="1">
+      <w:start w:val="1"/>
+      <w:numFmt w:val="bullet"/>
+      <w:lvlText w:val=""/>
+      <w:lvlJc w:val="left"/>
+      <w:pPr>
+        <w:ind w:left="4320" w:hanging="360"/>
+      </w:pPr>
+      <w:rPr>
+        <w:rFonts w:ascii="Wingdings" w:hAnsi="Wingdings" w:hint="default"/>
+      </w:rPr>
+    </w:lvl>
+    <w:lvl w:ilvl="6" w:tplc="04090001" w:tentative="1">
+      <w:start w:val="1"/>
+      <w:numFmt w:val="bullet"/>
+      <w:lvlText w:val=""/>
+      <w:lvlJc w:val="left"/>
+      <w:pPr>
+        <w:ind w:left="5040" w:hanging="360"/>
+      </w:pPr>
+      <w:rPr>
+        <w:rFonts w:ascii="Symbol" w:hAnsi="Symbol" w:hint="default"/>
+      </w:rPr>
+    </w:lvl>
+    <w:lvl w:ilvl="7" w:tplc="04090003" w:tentative="1">
+      <w:start w:val="1"/>
+      <w:numFmt w:val="bullet"/>
+      <w:lvlText w:val="o"/>
+      <w:lvlJc w:val="left"/>
+      <w:pPr>
+        <w:ind w:left="5760" w:hanging="360"/>
+      </w:pPr>
+      <w:rPr>
+        <w:rFonts w:ascii="Courier New" w:hAnsi="Courier New" w:cs="Courier New" w:hint="default"/>
+      </w:rPr>
+    </w:lvl>
+    <w:lvl w:ilvl="8" w:tplc="04090005" w:tentative="1">
+      <w:start w:val="1"/>
+      <w:numFmt w:val="bullet"/>
+      <w:lvlText w:val=""/>
+      <w:lvlJc w:val="left"/>
+      <w:pPr>
+        <w:ind w:left="6480" w:hanging="360"/>
+      </w:pPr>
+      <w:rPr>
+        <w:rFonts w:ascii="Wingdings" w:hAnsi="Wingdings" w:hint="default"/>
+      </w:rPr>
+    </w:lvl>
+  </w:abstractNum>
   <w:num w:numId="1" w16cid:durableId="687683513">
     <w:abstractNumId w:val="1"/>
   </w:num>
@@ -646,6 +791,9 @@
   </w:num>
   <w:num w:numId="3" w16cid:durableId="2045715861">
     <w:abstractNumId w:val="0"/>
+  </w:num>
+  <w:num w:numId="4" w16cid:durableId="1419597689">
+    <w:abstractNumId w:val="3"/>
   </w:num>
 </w:numbering>
 </file>

</xml_diff>

<commit_message>
new notes about spark, kubernetes, terraform, networking, bash, linux, delta lake, hdfs, yarn
</commit_message>
<xml_diff>
--- a/docker/docker notes.docx
+++ b/docker/docker notes.docx
@@ -90,6 +90,35 @@
         <w:pStyle w:val="Heading2"/>
       </w:pPr>
       <w:r>
+        <w:t>Build context directory</w:t>
+      </w:r>
+    </w:p>
+    <w:p>
+      <w:r>
+        <w:t>Build context directory is a directory which contains the Dockerfile and all the other files which will be used in the Dockerfile (which we will copy into an image using the COPY or ADD instructions).</w:t>
+      </w:r>
+    </w:p>
+    <w:p>
+      <w:r>
+        <w:t>We provide a path to this directory in the ‘docker build’ command</w:t>
+      </w:r>
+      <w:r>
+        <w:t xml:space="preserve">. </w:t>
+      </w:r>
+    </w:p>
+    <w:p>
+      <w:r>
+        <w:t>W</w:t>
+      </w:r>
+      <w:r>
+        <w:t>hat path we will need to specify in the COPY instruction depends on this path.</w:t>
+      </w:r>
+    </w:p>
+    <w:p>
+      <w:pPr>
+        <w:pStyle w:val="Heading2"/>
+      </w:pPr>
+      <w:r>
         <w:t>Bind Mounting</w:t>
       </w:r>
     </w:p>
@@ -173,7 +202,10 @@
         <w:pStyle w:val="Heading1"/>
       </w:pPr>
       <w:r>
-        <w:t>Comands</w:t>
+        <w:t xml:space="preserve">Dockerfile </w:t>
+      </w:r>
+      <w:r>
+        <w:t>Instructions</w:t>
       </w:r>
     </w:p>
     <w:p>
@@ -181,12 +213,75 @@
         <w:pStyle w:val="Heading2"/>
       </w:pPr>
       <w:r>
-        <w:t>Docker exec</w:t>
-      </w:r>
-    </w:p>
-    <w:p>
-      <w:r>
-        <w:t>Docker exec runs a new command inside of a running container. For example if we run:</w:t>
+        <w:t>RUN</w:t>
+      </w:r>
+    </w:p>
+    <w:p>
+      <w:r>
+        <w:t>The RUN instruction is used in order to execute a command in container’s terminal.</w:t>
+      </w:r>
+    </w:p>
+    <w:p>
+      <w:pPr>
+        <w:pStyle w:val="Heading2"/>
+      </w:pPr>
+      <w:r>
+        <w:lastRenderedPageBreak/>
+        <w:t>USER</w:t>
+      </w:r>
+    </w:p>
+    <w:p>
+      <w:r>
+        <w:t>We can use the USER instruction in order to change a user which will be executing a command used in the RUN instruction.</w:t>
+      </w:r>
+    </w:p>
+    <w:p>
+      <w:pPr>
+        <w:pStyle w:val="Heading2"/>
+      </w:pPr>
+      <w:r>
+        <w:t>SHELL</w:t>
+      </w:r>
+    </w:p>
+    <w:p>
+      <w:r>
+        <w:t xml:space="preserve">By default Docker run commands (from instructions like RUN, CMD, ENTRYPOINT) using </w:t>
+      </w:r>
+      <w:r>
+        <w:t>sh (</w:t>
+      </w:r>
+      <w:r>
+        <w:t>/bin/sh</w:t>
+      </w:r>
+      <w:r>
+        <w:t>)</w:t>
+      </w:r>
+      <w:r>
+        <w:t>. Using the SHELL instruction we can change it. We can specify there</w:t>
+      </w:r>
+      <w:r>
+        <w:t xml:space="preserve"> which</w:t>
+      </w:r>
+      <w:r>
+        <w:t xml:space="preserve"> shell to use, for example this changes shell into bash:</w:t>
+      </w:r>
+    </w:p>
+    <w:p>
+      <w:r>
+        <w:t>SHELL [“/bin/bash”, “-c”]</w:t>
+      </w:r>
+    </w:p>
+    <w:p>
+      <w:pPr>
+        <w:pStyle w:val="Heading2"/>
+      </w:pPr>
+      <w:r>
+        <w:t>COPY</w:t>
+      </w:r>
+    </w:p>
+    <w:p>
+      <w:r>
+        <w:t>Copy a file from a host to the created image. If has the following format:</w:t>
       </w:r>
     </w:p>
     <w:p>
@@ -194,119 +289,71 @@
         <w:pStyle w:val="ListParagraph"/>
         <w:numPr>
           <w:ilvl w:val="0"/>
-          <w:numId w:val="5"/>
+          <w:numId w:val="6"/>
         </w:numPr>
       </w:pPr>
       <w:r>
-        <w:t>Docker exec -it &lt;container_name_or_id&gt; /bin/bash</w:t>
-      </w:r>
-    </w:p>
-    <w:p>
-      <w:r>
-        <w:t xml:space="preserve">In simple words it gives us access to the container’s terminal. </w:t>
-      </w:r>
-    </w:p>
-    <w:p>
-      <w:r>
-        <w:t xml:space="preserve">To be more precise </w:t>
-      </w:r>
-      <w:r>
-        <w:t>it start</w:t>
-      </w:r>
-      <w:r>
-        <w:t>s</w:t>
-      </w:r>
-      <w:r>
-        <w:t xml:space="preserve"> a new bash session</w:t>
-      </w:r>
-      <w:r>
-        <w:t xml:space="preserve"> inside of a container</w:t>
-      </w:r>
-      <w:r>
-        <w:t xml:space="preserve"> and allocates a pseudo terminal</w:t>
-      </w:r>
-      <w:r>
-        <w:t xml:space="preserve"> </w:t>
-      </w:r>
-      <w:r>
-        <w:t>which we can use</w:t>
-      </w:r>
-      <w:r>
-        <w:t xml:space="preserve"> from our computer’s terminal.</w:t>
-      </w:r>
-    </w:p>
-    <w:p>
-      <w:pPr>
-        <w:pStyle w:val="Heading1"/>
-      </w:pPr>
-      <w:r>
-        <w:lastRenderedPageBreak/>
-        <w:t xml:space="preserve">Dockerfile </w:t>
-      </w:r>
-      <w:r>
-        <w:t>Instructions</w:t>
-      </w:r>
-    </w:p>
-    <w:p>
-      <w:pPr>
-        <w:pStyle w:val="Heading2"/>
-      </w:pPr>
-      <w:r>
-        <w:t>RUN</w:t>
-      </w:r>
-    </w:p>
-    <w:p>
-      <w:r>
-        <w:t>The RUN instruction is used in order to execute a command in container’s terminal.</w:t>
-      </w:r>
-    </w:p>
-    <w:p>
-      <w:pPr>
-        <w:pStyle w:val="Heading2"/>
-      </w:pPr>
-      <w:r>
-        <w:t>USER</w:t>
-      </w:r>
-    </w:p>
-    <w:p>
-      <w:r>
-        <w:t>We can use the USER instruction in order to change a user which will be executing a command used in the RUN instruction.</w:t>
-      </w:r>
-    </w:p>
-    <w:p>
-      <w:pPr>
-        <w:pStyle w:val="Heading2"/>
-      </w:pPr>
-      <w:r>
-        <w:t>SHELL</w:t>
-      </w:r>
-    </w:p>
-    <w:p>
-      <w:r>
-        <w:t xml:space="preserve">By default Docker run commands (from instructions like RUN, CMD, ENTRYPOINT) using </w:t>
-      </w:r>
-      <w:r>
-        <w:t>sh (</w:t>
-      </w:r>
-      <w:r>
-        <w:t>/bin/sh</w:t>
-      </w:r>
-      <w:r>
-        <w:t>)</w:t>
-      </w:r>
-      <w:r>
-        <w:t>. Using the SHELL instruction we can change it. We can specify there</w:t>
-      </w:r>
-      <w:r>
-        <w:t xml:space="preserve"> which</w:t>
-      </w:r>
-      <w:r>
-        <w:t xml:space="preserve"> shell to use, for example this changes shell into bash:</w:t>
-      </w:r>
-    </w:p>
-    <w:p>
-      <w:r>
-        <w:t>SHELL [“/bin/bash”, “-c”]</w:t>
+        <w:t>COPY local_path container_path</w:t>
+      </w:r>
+    </w:p>
+    <w:p>
+      <w:r>
+        <w:t>Where:</w:t>
+      </w:r>
+    </w:p>
+    <w:p>
+      <w:pPr>
+        <w:pStyle w:val="ListParagraph"/>
+        <w:numPr>
+          <w:ilvl w:val="0"/>
+          <w:numId w:val="6"/>
+        </w:numPr>
+      </w:pPr>
+      <w:r>
+        <w:rPr>
+          <w:b/>
+          <w:bCs/>
+        </w:rPr>
+        <w:t>Local_path</w:t>
+      </w:r>
+      <w:r>
+        <w:t xml:space="preserve"> – Is a path on a local host where is located a file to copy. This path needs to be relative to </w:t>
+      </w:r>
+      <w:r>
+        <w:t xml:space="preserve">the </w:t>
+      </w:r>
+      <w:r>
+        <w:t>build context directory.</w:t>
+      </w:r>
+    </w:p>
+    <w:p>
+      <w:pPr>
+        <w:pStyle w:val="ListParagraph"/>
+        <w:numPr>
+          <w:ilvl w:val="0"/>
+          <w:numId w:val="6"/>
+        </w:numPr>
+        <w:rPr>
+          <w:b/>
+          <w:bCs/>
+        </w:rPr>
+      </w:pPr>
+      <w:r>
+        <w:rPr>
+          <w:b/>
+          <w:bCs/>
+        </w:rPr>
+        <w:t>Container_path</w:t>
+      </w:r>
+      <w:r>
+        <w:rPr>
+          <w:b/>
+          <w:bCs/>
+        </w:rPr>
+        <w:t xml:space="preserve"> – </w:t>
+      </w:r>
+      <w:r>
+        <w:t>Is a path in a container where to save a file</w:t>
       </w:r>
     </w:p>
     <w:p>
@@ -469,6 +516,7 @@
         </w:numPr>
       </w:pPr>
       <w:r>
+        <w:lastRenderedPageBreak/>
         <w:t>Local\Packages – look for any files containing ‘docker’ in its name</w:t>
       </w:r>
     </w:p>
@@ -489,7 +537,6 @@
         <w:pStyle w:val="Heading2"/>
       </w:pPr>
       <w:r>
-        <w:lastRenderedPageBreak/>
         <w:t>Debugging on Linux</w:t>
       </w:r>
     </w:p>
@@ -539,6 +586,119 @@
 <file path=word/numbering.xml><?xml version="1.0" encoding="utf-8"?>
 <w:numbering xmlns:wpc="http://schemas.microsoft.com/office/word/2010/wordprocessingCanvas" xmlns:cx="http://schemas.microsoft.com/office/drawing/2014/chartex" xmlns:cx1="http://schemas.microsoft.com/office/drawing/2015/9/8/chartex" xmlns:cx2="http://schemas.microsoft.com/office/drawing/2015/10/21/chartex" xmlns:cx3="http://schemas.microsoft.com/office/drawing/2016/5/9/chartex" xmlns:cx4="http://schemas.microsoft.com/office/drawing/2016/5/10/chartex" xmlns:cx5="http://schemas.microsoft.com/office/drawing/2016/5/11/chartex" xmlns:cx6="http://schemas.microsoft.com/office/drawing/2016/5/12/chartex" xmlns:cx7="http://schemas.microsoft.com/office/drawing/2016/5/13/chartex" xmlns:cx8="http://schemas.microsoft.com/office/drawing/2016/5/14/chartex" xmlns:mc="http://schemas.openxmlformats.org/markup-compatibility/2006" xmlns:aink="http://schemas.microsoft.com/office/drawing/2016/ink" xmlns:am3d="http://schemas.microsoft.com/office/drawing/2017/model3d" xmlns:o="urn:schemas-microsoft-com:office:office" xmlns:oel="http://schemas.microsoft.com/office/2019/extlst" xmlns:r="http://schemas.openxmlformats.org/officeDocument/2006/relationships" xmlns:m="http://schemas.openxmlformats.org/officeDocument/2006/math" xmlns:v="urn:schemas-microsoft-com:vml" xmlns:wp14="http://schemas.microsoft.com/office/word/2010/wordprocessingDrawing" xmlns:wp="http://schemas.openxmlformats.org/drawingml/2006/wordprocessingDrawing" xmlns:w10="urn:schemas-microsoft-com:office:word" xmlns:w="http://schemas.openxmlformats.org/wordprocessingml/2006/main" xmlns:w14="http://schemas.microsoft.com/office/word/2010/wordml" xmlns:w15="http://schemas.microsoft.com/office/word/2012/wordml" xmlns:w16cex="http://schemas.microsoft.com/office/word/2018/wordml/cex" xmlns:w16cid="http://schemas.microsoft.com/office/word/2016/wordml/cid" xmlns:w16="http://schemas.microsoft.com/office/word/2018/wordml" xmlns:w16du="http://schemas.microsoft.com/office/word/2023/wordml/word16du" xmlns:w16sdtdh="http://schemas.microsoft.com/office/word/2020/wordml/sdtdatahash" xmlns:w16sdtfl="http://schemas.microsoft.com/office/word/2024/wordml/sdtformatlock" xmlns:w16se="http://schemas.microsoft.com/office/word/2015/wordml/symex" xmlns:wpg="http://schemas.microsoft.com/office/word/2010/wordprocessingGroup" xmlns:wpi="http://schemas.microsoft.com/office/word/2010/wordprocessingInk" xmlns:wne="http://schemas.microsoft.com/office/word/2006/wordml" xmlns:wps="http://schemas.microsoft.com/office/word/2010/wordprocessingShape" mc:Ignorable="w14 w15 w16se w16cid w16 w16cex w16sdtdh w16sdtfl w16du wp14">
   <w:abstractNum w:abstractNumId="0" w15:restartNumberingAfterBreak="0">
+    <w:nsid w:val="001D02E9"/>
+    <w:multiLevelType w:val="hybridMultilevel"/>
+    <w:tmpl w:val="45424ADC"/>
+    <w:lvl w:ilvl="0" w:tplc="04090001">
+      <w:start w:val="1"/>
+      <w:numFmt w:val="bullet"/>
+      <w:lvlText w:val=""/>
+      <w:lvlJc w:val="left"/>
+      <w:pPr>
+        <w:ind w:left="720" w:hanging="360"/>
+      </w:pPr>
+      <w:rPr>
+        <w:rFonts w:ascii="Symbol" w:hAnsi="Symbol" w:hint="default"/>
+      </w:rPr>
+    </w:lvl>
+    <w:lvl w:ilvl="1" w:tplc="04090003" w:tentative="1">
+      <w:start w:val="1"/>
+      <w:numFmt w:val="bullet"/>
+      <w:lvlText w:val="o"/>
+      <w:lvlJc w:val="left"/>
+      <w:pPr>
+        <w:ind w:left="1440" w:hanging="360"/>
+      </w:pPr>
+      <w:rPr>
+        <w:rFonts w:ascii="Courier New" w:hAnsi="Courier New" w:cs="Courier New" w:hint="default"/>
+      </w:rPr>
+    </w:lvl>
+    <w:lvl w:ilvl="2" w:tplc="04090005" w:tentative="1">
+      <w:start w:val="1"/>
+      <w:numFmt w:val="bullet"/>
+      <w:lvlText w:val=""/>
+      <w:lvlJc w:val="left"/>
+      <w:pPr>
+        <w:ind w:left="2160" w:hanging="360"/>
+      </w:pPr>
+      <w:rPr>
+        <w:rFonts w:ascii="Wingdings" w:hAnsi="Wingdings" w:hint="default"/>
+      </w:rPr>
+    </w:lvl>
+    <w:lvl w:ilvl="3" w:tplc="04090001" w:tentative="1">
+      <w:start w:val="1"/>
+      <w:numFmt w:val="bullet"/>
+      <w:lvlText w:val=""/>
+      <w:lvlJc w:val="left"/>
+      <w:pPr>
+        <w:ind w:left="2880" w:hanging="360"/>
+      </w:pPr>
+      <w:rPr>
+        <w:rFonts w:ascii="Symbol" w:hAnsi="Symbol" w:hint="default"/>
+      </w:rPr>
+    </w:lvl>
+    <w:lvl w:ilvl="4" w:tplc="04090003" w:tentative="1">
+      <w:start w:val="1"/>
+      <w:numFmt w:val="bullet"/>
+      <w:lvlText w:val="o"/>
+      <w:lvlJc w:val="left"/>
+      <w:pPr>
+        <w:ind w:left="3600" w:hanging="360"/>
+      </w:pPr>
+      <w:rPr>
+        <w:rFonts w:ascii="Courier New" w:hAnsi="Courier New" w:cs="Courier New" w:hint="default"/>
+      </w:rPr>
+    </w:lvl>
+    <w:lvl w:ilvl="5" w:tplc="04090005" w:tentative="1">
+      <w:start w:val="1"/>
+      <w:numFmt w:val="bullet"/>
+      <w:lvlText w:val=""/>
+      <w:lvlJc w:val="left"/>
+      <w:pPr>
+        <w:ind w:left="4320" w:hanging="360"/>
+      </w:pPr>
+      <w:rPr>
+        <w:rFonts w:ascii="Wingdings" w:hAnsi="Wingdings" w:hint="default"/>
+      </w:rPr>
+    </w:lvl>
+    <w:lvl w:ilvl="6" w:tplc="04090001" w:tentative="1">
+      <w:start w:val="1"/>
+      <w:numFmt w:val="bullet"/>
+      <w:lvlText w:val=""/>
+      <w:lvlJc w:val="left"/>
+      <w:pPr>
+        <w:ind w:left="5040" w:hanging="360"/>
+      </w:pPr>
+      <w:rPr>
+        <w:rFonts w:ascii="Symbol" w:hAnsi="Symbol" w:hint="default"/>
+      </w:rPr>
+    </w:lvl>
+    <w:lvl w:ilvl="7" w:tplc="04090003" w:tentative="1">
+      <w:start w:val="1"/>
+      <w:numFmt w:val="bullet"/>
+      <w:lvlText w:val="o"/>
+      <w:lvlJc w:val="left"/>
+      <w:pPr>
+        <w:ind w:left="5760" w:hanging="360"/>
+      </w:pPr>
+      <w:rPr>
+        <w:rFonts w:ascii="Courier New" w:hAnsi="Courier New" w:cs="Courier New" w:hint="default"/>
+      </w:rPr>
+    </w:lvl>
+    <w:lvl w:ilvl="8" w:tplc="04090005" w:tentative="1">
+      <w:start w:val="1"/>
+      <w:numFmt w:val="bullet"/>
+      <w:lvlText w:val=""/>
+      <w:lvlJc w:val="left"/>
+      <w:pPr>
+        <w:ind w:left="6480" w:hanging="360"/>
+      </w:pPr>
+      <w:rPr>
+        <w:rFonts w:ascii="Wingdings" w:hAnsi="Wingdings" w:hint="default"/>
+      </w:rPr>
+    </w:lvl>
+  </w:abstractNum>
+  <w:abstractNum w:abstractNumId="1" w15:restartNumberingAfterBreak="0">
     <w:nsid w:val="08695CC9"/>
     <w:multiLevelType w:val="hybridMultilevel"/>
     <w:tmpl w:val="AC782CC2"/>
@@ -651,7 +811,7 @@
       </w:rPr>
     </w:lvl>
   </w:abstractNum>
-  <w:abstractNum w:abstractNumId="1" w15:restartNumberingAfterBreak="0">
+  <w:abstractNum w:abstractNumId="2" w15:restartNumberingAfterBreak="0">
     <w:nsid w:val="26540E8B"/>
     <w:multiLevelType w:val="hybridMultilevel"/>
     <w:tmpl w:val="2690C57E"/>
@@ -763,7 +923,7 @@
       </w:rPr>
     </w:lvl>
   </w:abstractNum>
-  <w:abstractNum w:abstractNumId="2" w15:restartNumberingAfterBreak="0">
+  <w:abstractNum w:abstractNumId="3" w15:restartNumberingAfterBreak="0">
     <w:nsid w:val="5A28057C"/>
     <w:multiLevelType w:val="hybridMultilevel"/>
     <w:tmpl w:val="246E029A"/>
@@ -902,7 +1062,7 @@
       </w:rPr>
     </w:lvl>
   </w:abstractNum>
-  <w:abstractNum w:abstractNumId="3" w15:restartNumberingAfterBreak="0">
+  <w:abstractNum w:abstractNumId="4" w15:restartNumberingAfterBreak="0">
     <w:nsid w:val="68781089"/>
     <w:multiLevelType w:val="hybridMultilevel"/>
     <w:tmpl w:val="03D2E3D2"/>
@@ -1015,7 +1175,120 @@
       </w:rPr>
     </w:lvl>
   </w:abstractNum>
-  <w:abstractNum w:abstractNumId="4" w15:restartNumberingAfterBreak="0">
+  <w:abstractNum w:abstractNumId="5" w15:restartNumberingAfterBreak="0">
+    <w:nsid w:val="74954FD1"/>
+    <w:multiLevelType w:val="hybridMultilevel"/>
+    <w:tmpl w:val="37647140"/>
+    <w:lvl w:ilvl="0" w:tplc="04090001">
+      <w:start w:val="1"/>
+      <w:numFmt w:val="bullet"/>
+      <w:lvlText w:val=""/>
+      <w:lvlJc w:val="left"/>
+      <w:pPr>
+        <w:ind w:left="720" w:hanging="360"/>
+      </w:pPr>
+      <w:rPr>
+        <w:rFonts w:ascii="Symbol" w:hAnsi="Symbol" w:hint="default"/>
+      </w:rPr>
+    </w:lvl>
+    <w:lvl w:ilvl="1" w:tplc="04090003" w:tentative="1">
+      <w:start w:val="1"/>
+      <w:numFmt w:val="bullet"/>
+      <w:lvlText w:val="o"/>
+      <w:lvlJc w:val="left"/>
+      <w:pPr>
+        <w:ind w:left="1440" w:hanging="360"/>
+      </w:pPr>
+      <w:rPr>
+        <w:rFonts w:ascii="Courier New" w:hAnsi="Courier New" w:cs="Courier New" w:hint="default"/>
+      </w:rPr>
+    </w:lvl>
+    <w:lvl w:ilvl="2" w:tplc="04090005" w:tentative="1">
+      <w:start w:val="1"/>
+      <w:numFmt w:val="bullet"/>
+      <w:lvlText w:val=""/>
+      <w:lvlJc w:val="left"/>
+      <w:pPr>
+        <w:ind w:left="2160" w:hanging="360"/>
+      </w:pPr>
+      <w:rPr>
+        <w:rFonts w:ascii="Wingdings" w:hAnsi="Wingdings" w:hint="default"/>
+      </w:rPr>
+    </w:lvl>
+    <w:lvl w:ilvl="3" w:tplc="04090001" w:tentative="1">
+      <w:start w:val="1"/>
+      <w:numFmt w:val="bullet"/>
+      <w:lvlText w:val=""/>
+      <w:lvlJc w:val="left"/>
+      <w:pPr>
+        <w:ind w:left="2880" w:hanging="360"/>
+      </w:pPr>
+      <w:rPr>
+        <w:rFonts w:ascii="Symbol" w:hAnsi="Symbol" w:hint="default"/>
+      </w:rPr>
+    </w:lvl>
+    <w:lvl w:ilvl="4" w:tplc="04090003" w:tentative="1">
+      <w:start w:val="1"/>
+      <w:numFmt w:val="bullet"/>
+      <w:lvlText w:val="o"/>
+      <w:lvlJc w:val="left"/>
+      <w:pPr>
+        <w:ind w:left="3600" w:hanging="360"/>
+      </w:pPr>
+      <w:rPr>
+        <w:rFonts w:ascii="Courier New" w:hAnsi="Courier New" w:cs="Courier New" w:hint="default"/>
+      </w:rPr>
+    </w:lvl>
+    <w:lvl w:ilvl="5" w:tplc="04090005" w:tentative="1">
+      <w:start w:val="1"/>
+      <w:numFmt w:val="bullet"/>
+      <w:lvlText w:val=""/>
+      <w:lvlJc w:val="left"/>
+      <w:pPr>
+        <w:ind w:left="4320" w:hanging="360"/>
+      </w:pPr>
+      <w:rPr>
+        <w:rFonts w:ascii="Wingdings" w:hAnsi="Wingdings" w:hint="default"/>
+      </w:rPr>
+    </w:lvl>
+    <w:lvl w:ilvl="6" w:tplc="04090001" w:tentative="1">
+      <w:start w:val="1"/>
+      <w:numFmt w:val="bullet"/>
+      <w:lvlText w:val=""/>
+      <w:lvlJc w:val="left"/>
+      <w:pPr>
+        <w:ind w:left="5040" w:hanging="360"/>
+      </w:pPr>
+      <w:rPr>
+        <w:rFonts w:ascii="Symbol" w:hAnsi="Symbol" w:hint="default"/>
+      </w:rPr>
+    </w:lvl>
+    <w:lvl w:ilvl="7" w:tplc="04090003" w:tentative="1">
+      <w:start w:val="1"/>
+      <w:numFmt w:val="bullet"/>
+      <w:lvlText w:val="o"/>
+      <w:lvlJc w:val="left"/>
+      <w:pPr>
+        <w:ind w:left="5760" w:hanging="360"/>
+      </w:pPr>
+      <w:rPr>
+        <w:rFonts w:ascii="Courier New" w:hAnsi="Courier New" w:cs="Courier New" w:hint="default"/>
+      </w:rPr>
+    </w:lvl>
+    <w:lvl w:ilvl="8" w:tplc="04090005" w:tentative="1">
+      <w:start w:val="1"/>
+      <w:numFmt w:val="bullet"/>
+      <w:lvlText w:val=""/>
+      <w:lvlJc w:val="left"/>
+      <w:pPr>
+        <w:ind w:left="6480" w:hanging="360"/>
+      </w:pPr>
+      <w:rPr>
+        <w:rFonts w:ascii="Wingdings" w:hAnsi="Wingdings" w:hint="default"/>
+      </w:rPr>
+    </w:lvl>
+  </w:abstractNum>
+  <w:abstractNum w:abstractNumId="6" w15:restartNumberingAfterBreak="0">
     <w:nsid w:val="796C0646"/>
     <w:multiLevelType w:val="hybridMultilevel"/>
     <w:tmpl w:val="AA1EAC44"/>
@@ -1129,19 +1402,25 @@
     </w:lvl>
   </w:abstractNum>
   <w:num w:numId="1" w16cid:durableId="687683513">
+    <w:abstractNumId w:val="3"/>
+  </w:num>
+  <w:num w:numId="2" w16cid:durableId="1403598283">
+    <w:abstractNumId w:val="4"/>
+  </w:num>
+  <w:num w:numId="3" w16cid:durableId="2045715861">
+    <w:abstractNumId w:val="1"/>
+  </w:num>
+  <w:num w:numId="4" w16cid:durableId="1419597689">
+    <w:abstractNumId w:val="6"/>
+  </w:num>
+  <w:num w:numId="5" w16cid:durableId="698166112">
     <w:abstractNumId w:val="2"/>
   </w:num>
-  <w:num w:numId="2" w16cid:durableId="1403598283">
-    <w:abstractNumId w:val="3"/>
+  <w:num w:numId="6" w16cid:durableId="2015917396">
+    <w:abstractNumId w:val="5"/>
   </w:num>
-  <w:num w:numId="3" w16cid:durableId="2045715861">
+  <w:num w:numId="7" w16cid:durableId="1322078429">
     <w:abstractNumId w:val="0"/>
-  </w:num>
-  <w:num w:numId="4" w16cid:durableId="1419597689">
-    <w:abstractNumId w:val="4"/>
-  </w:num>
-  <w:num w:numId="5" w16cid:durableId="698166112">
-    <w:abstractNumId w:val="1"/>
   </w:num>
 </w:numbering>
 </file>

</xml_diff>